<commit_message>
Add order survey routes, GeoPackage area import, and faster snapshot lookups.
Build OSRM walking routes for area orders, let admins import GPKG polygons into tasks_area, and tighten geometry/task-key queries plus OATI letter fields.

Co-authored-by: Cursor <cursoragent@cursor.com>
</commit_message>
<xml_diff>
--- a/backend/app/letters/templates/oati_letter.docx
+++ b/backend/app/letters/templates/oati_letter.docx
@@ -267,51 +267,50 @@
           </w:tcPr>
           <w:p>
             <w:pPr>
-              <w:pStyle w:val="Normal.0"/>
-              <w:ind w:left="733" w:right="580" w:firstLine="0"/>
+              <w:spacing w:line="288" w:lineRule="auto"/>
+              <w:ind w:left="-706" w:hanging="4"/>
               <w:rPr>
-                <w:sz w:val="2"/>
-                <w:szCs w:val="2"/>
-                <w:shd w:val="nil" w:color="auto" w:fill="auto"/>
-                <w:lang w:val="ru-RU"/>
+                <w:rFonts w:eastAsia="Times New Roman" w:cs="Times New Roman"/>
+                <w:color w:val="auto"/>
+                <w:sz w:val="28"/>
+                <w:szCs w:val="28"/>
               </w:rPr>
             </w:pPr>
             <w:r>
-              <w:t>ОАТИ города Москвы</w:t>
+              <w:rPr>
+                <w:rFonts w:eastAsia="Times New Roman" w:cs="Times New Roman"/>
+                <w:color w:val="auto"/>
+                <w:sz w:val="28"/>
+                <w:szCs w:val="28"/>
+              </w:rPr>
+              <w:t xml:space="preserve">Объединению административно-технических инспекций города Москвы </w:t>
             </w:r>
           </w:p>
           <w:p>
             <w:pPr>
-              <w:pStyle w:val="Normal.0"/>
               <w:spacing w:line="288" w:lineRule="auto"/>
               <w:rPr>
-                <w:b w:val="1"/>
-                <w:bCs w:val="1"/>
+                <w:b/>
+                <w:bCs/>
                 <w:sz w:val="28"/>
                 <w:szCs w:val="28"/>
-                <w:shd w:val="nil" w:color="auto" w:fill="auto"/>
-                <w:lang w:val="ru-RU"/>
               </w:rPr>
             </w:pPr>
           </w:p>
           <w:p>
             <w:pPr>
-              <w:pStyle w:val="Normal.0"/>
               <w:ind w:right="580"/>
               <w:rPr>
-                <w:b w:val="1"/>
-                <w:bCs w:val="1"/>
+                <w:b/>
+                <w:bCs/>
                 <w:sz w:val="23"/>
                 <w:szCs w:val="23"/>
-                <w:shd w:val="nil" w:color="auto" w:fill="auto"/>
-                <w:lang w:val="ru-RU"/>
               </w:rPr>
             </w:pPr>
           </w:p>
           <w:p>
             <w:pPr>
-              <w:pStyle w:val="Normal.0"/>
-              <w:ind w:left="34" w:right="580" w:firstLine="0"/>
+              <w:ind w:left="34" w:right="580"/>
             </w:pPr>
           </w:p>
         </w:tc>

</xml_diff>